<commit_message>
Deploy preview for PR 556 🛫
</commit_message>
<xml_diff>
--- a/pr-preview/pr-556/UCD-SeRG-Lab-Manual-tracked-changes.docx
+++ b/pr-preview/pr-556/UCD-SeRG-Lab-Manual-tracked-changes.docx
@@ -22218,15 +22218,16 @@
           <w:t xml:space="preserve"> </w:t>
         </w:r>
       </w:ins>
-      <w:ins w:id="1696" w:author="PR Preview" w:date="2024-01-01T00:00:00Z">
-        <w:r>
-          <w:rPr>
+      <w:hyperlink r:id="rId853">
+        <w:r>
+          <w:rPr>
+            <w:rStyle w:val="Hyperlink"/>
             <w:i/>
             <w:iCs/>
           </w:rPr>
           <w:t xml:space="preserve">Principles of Scientific Writing</w:t>
         </w:r>
-      </w:ins>
+      </w:hyperlink>
     </w:p>
     <w:p>
       <w:pPr>
@@ -28787,7 +28788,7 @@
       </w:ins>
       <w:ins w:id="986" w:author="PR Preview" w:date="2024-01-01T00:00:00Z">
         <w:r>
-          <w:t xml:space="preserve">2fdb631</w:t>
+          <w:t xml:space="preserve">d23afdb</w:t>
         </w:r>
       </w:ins>
     </w:p>
@@ -28815,7 +28816,7 @@
       </w:ins>
       <w:ins w:id="987" w:author="PR Preview" w:date="2024-01-01T00:00:00Z">
         <w:r>
-          <w:t xml:space="preserve">2fdb63122d54cf83a30082b2c2b7052e7ca0097a</w:t>
+          <w:t xml:space="preserve">d23afdb7e35d78109e29722e032664ae9b22c9a8</w:t>
         </w:r>
       </w:ins>
     </w:p>
@@ -28843,7 +28844,7 @@
       </w:ins>
       <w:ins w:id="988" w:author="PR Preview" w:date="2024-01-01T00:00:00Z">
         <w:r>
-          <w:t xml:space="preserve">2026-10-12 06:50:43 +0000</w:t>
+          <w:t xml:space="preserve">2026-10-12 06:55:22 +0000</w:t>
         </w:r>
       </w:ins>
     </w:p>

</xml_diff>